<commit_message>
Explain connector account and daily quota
</commit_message>
<xml_diff>
--- a/docs/Claude_Connector_Kullanim_Kilavuzu.docx
+++ b/docs/Claude_Connector_Kullanim_Kilavuzu.docx
@@ -382,18 +382,17 @@
           <w:rFonts w:ascii="Calibri" w:hAnsi="Calibri"/>
           <w:b/>
           <w:color w:val="19304F"/>
-          <w:sz w:val="19"/>
+          <w:sz w:val="18"/>
         </w:rPr>
-        <w:t xml:space="preserve">Not: </w:t>
+        <w:t xml:space="preserve">Neden hesap oluşturulmalı? </w:t>
       </w:r>
       <w:r>
         <w:rPr>
           <w:rFonts w:ascii="Calibri" w:hAnsi="Calibri"/>
-          <w:b w:val="0"/>
           <w:color w:val="19304F"/>
-          <w:sz w:val="19"/>
+          <w:sz w:val="18"/>
         </w:rPr>
-        <w:t>Kullanıcı başına günlük en fazla 30 veri sorgusu kullanılabilir.</w:t>
+        <w:t>Connector, günlük kullanım hakkını kullanıcı bazında güvenli ve adil biçimde takip eder. Bu nedenle her kullanıcı kendi hesabıyla giriş yapar. Kullanıcı başına günlük soru sayısı en fazla 30'dur. Hesap yalnızca kimlik doğrulama ve kullanım kotası için kullanılır; AWS Console veya veri kaynağı erişimi sağlamaz.</w:t>
       </w:r>
     </w:p>
     <w:p>

</xml_diff>